<commit_message>
Fixed error 487 "ophævelsestegn" -> Opløsningstegn
</commit_message>
<xml_diff>
--- a/Documentation/Official Documentation/Release Notes/Release Notes for IBOS Nodelæser version 4.1.0.0.docx
+++ b/Documentation/Official Documentation/Release Notes/Release Notes for IBOS Nodelæser version 4.1.0.0.docx
@@ -26,19 +26,7 @@
         <w:rPr>
           <w:color w:val="000000"/>
         </w:rPr>
-        <w:t>.</w:t>
-      </w:r>
-      <w:r>
-        <w:rPr>
-          <w:color w:val="000000"/>
-        </w:rPr>
-        <w:t>1</w:t>
-      </w:r>
-      <w:r>
-        <w:rPr>
-          <w:color w:val="000000"/>
-        </w:rPr>
-        <w:t>.</w:t>
+        <w:t>.1.</w:t>
       </w:r>
       <w:r>
         <w:rPr>
@@ -239,169 +227,89 @@
           <w:bCs w:val="false"/>
           <w:color w:val="000000"/>
         </w:rPr>
-        <w:t xml:space="preserve">Det nye værktøj </w:t>
-      </w:r>
-      <w:r>
-        <w:rPr>
-          <w:b w:val="false"/>
-          <w:bCs w:val="false"/>
-          <w:color w:val="000000"/>
-        </w:rPr>
-        <w:t>”IBOS punktnodelæser” understøtter også (i et vist omfang) eksport af de indlæste punktnode</w:t>
-      </w:r>
-      <w:r>
-        <w:rPr>
-          <w:b w:val="false"/>
-          <w:bCs w:val="false"/>
-          <w:color w:val="000000"/>
-        </w:rPr>
-        <w:t>filer</w:t>
-      </w:r>
-      <w:r>
-        <w:rPr>
-          <w:b w:val="false"/>
-          <w:bCs w:val="false"/>
-          <w:color w:val="000000"/>
-        </w:rPr>
-        <w:t xml:space="preserve"> til MusicXml.</w:t>
-      </w:r>
-    </w:p>
-    <w:p>
-      <w:pPr>
-        <w:pStyle w:val="Standard"/>
-        <w:bidi w:val="0"/>
-        <w:jc w:val="left"/>
-        <w:rPr>
-          <w:b w:val="false"/>
-          <w:b w:val="false"/>
-          <w:bCs w:val="false"/>
-          <w:color w:val="000000"/>
-        </w:rPr>
-      </w:pPr>
-      <w:r>
-        <w:rPr>
-          <w:b w:val="false"/>
-          <w:bCs w:val="false"/>
-          <w:color w:val="000000"/>
-        </w:rPr>
-      </w:r>
-    </w:p>
-    <w:p>
-      <w:pPr>
-        <w:pStyle w:val="Standard"/>
-        <w:bidi w:val="0"/>
-        <w:jc w:val="left"/>
-        <w:rPr>
-          <w:b w:val="false"/>
-          <w:b w:val="false"/>
-          <w:bCs w:val="false"/>
-          <w:color w:val="000000"/>
-        </w:rPr>
-      </w:pPr>
-      <w:r>
-        <w:rPr>
-          <w:b w:val="false"/>
-          <w:bCs w:val="false"/>
-          <w:color w:val="000000"/>
-        </w:rPr>
-        <w:t xml:space="preserve">Generel understøttelse af .pef filformatet (Portable Embosser Format) </w:t>
-      </w:r>
-      <w:r>
-        <w:rPr>
-          <w:b w:val="false"/>
-          <w:bCs w:val="false"/>
-          <w:color w:val="000000"/>
-        </w:rPr>
-        <w:t>både som input og output.</w:t>
-      </w:r>
-    </w:p>
-    <w:p>
-      <w:pPr>
-        <w:pStyle w:val="Standard"/>
-        <w:bidi w:val="0"/>
-        <w:jc w:val="left"/>
-        <w:rPr>
-          <w:b w:val="false"/>
-          <w:b w:val="false"/>
-          <w:bCs w:val="false"/>
-          <w:color w:val="000000"/>
-        </w:rPr>
-      </w:pPr>
-      <w:r>
-        <w:rPr>
-          <w:b w:val="false"/>
-          <w:bCs w:val="false"/>
-          <w:color w:val="000000"/>
-        </w:rPr>
-      </w:r>
-    </w:p>
-    <w:p>
-      <w:pPr>
-        <w:pStyle w:val="Standard"/>
-        <w:bidi w:val="0"/>
-        <w:jc w:val="left"/>
-        <w:rPr>
-          <w:b w:val="false"/>
-          <w:b w:val="false"/>
-          <w:bCs w:val="false"/>
-          <w:color w:val="000000"/>
-        </w:rPr>
-      </w:pPr>
-      <w:r>
-        <w:rPr>
-          <w:b w:val="false"/>
-          <w:bCs w:val="false"/>
-          <w:color w:val="000000"/>
-        </w:rPr>
-        <w:t xml:space="preserve">En ny profil ”Højhastigheds Punktprinter” er tilføjet. Denne profil indeholder </w:t>
-      </w:r>
-      <w:r>
-        <w:rPr>
-          <w:b w:val="false"/>
-          <w:bCs w:val="false"/>
-          <w:color w:val="000000"/>
-        </w:rPr>
-        <w:t xml:space="preserve">som </w:t>
-      </w:r>
-      <w:r>
-        <w:rPr>
-          <w:b w:val="false"/>
-          <w:bCs w:val="false"/>
-          <w:color w:val="000000"/>
-        </w:rPr>
-        <w:t xml:space="preserve"> default </w:t>
-      </w:r>
-      <w:r>
-        <w:rPr>
-          <w:b w:val="false"/>
-          <w:bCs w:val="false"/>
-          <w:color w:val="000000"/>
-        </w:rPr>
-        <w:t xml:space="preserve">standard </w:t>
-      </w:r>
-      <w:r>
-        <w:rPr>
-          <w:b w:val="false"/>
-          <w:bCs w:val="false"/>
-          <w:color w:val="000000"/>
-        </w:rPr>
-        <w:t xml:space="preserve">opsætninger til en ”Braillo  650 SF”  (Filformat=PEF, Bredde=32, Højde= 25) men kan ligesom de 3 eksisterende profiler </w:t>
-      </w:r>
-      <w:r>
-        <w:rPr>
-          <w:b w:val="false"/>
-          <w:bCs w:val="false"/>
-          <w:color w:val="000000"/>
-        </w:rPr>
-        <w:t xml:space="preserve">let </w:t>
-      </w:r>
-      <w:r>
-        <w:rPr>
-          <w:b w:val="false"/>
-          <w:bCs w:val="false"/>
-          <w:color w:val="000000"/>
-        </w:rPr>
-        <w:t>tilpasses af brugeren.</w:t>
+        <w:t>Det nye værktøj ”IBOS punktnodelæser” understøtter også (i et vist omfang) eksport af de indlæste punktnodefiler til MusicXml.</w:t>
+      </w:r>
+    </w:p>
+    <w:p>
+      <w:pPr>
+        <w:pStyle w:val="Standard"/>
+        <w:bidi w:val="0"/>
+        <w:jc w:val="left"/>
+        <w:rPr>
+          <w:b w:val="false"/>
+          <w:b w:val="false"/>
+          <w:bCs w:val="false"/>
+          <w:color w:val="000000"/>
+        </w:rPr>
+      </w:pPr>
+      <w:r>
+        <w:rPr>
+          <w:b w:val="false"/>
+          <w:bCs w:val="false"/>
+          <w:color w:val="000000"/>
+        </w:rPr>
+      </w:r>
+    </w:p>
+    <w:p>
+      <w:pPr>
+        <w:pStyle w:val="Standard"/>
+        <w:bidi w:val="0"/>
+        <w:jc w:val="left"/>
+        <w:rPr>
+          <w:b w:val="false"/>
+          <w:b w:val="false"/>
+          <w:bCs w:val="false"/>
+          <w:color w:val="000000"/>
+        </w:rPr>
+      </w:pPr>
+      <w:r>
+        <w:rPr>
+          <w:b w:val="false"/>
+          <w:bCs w:val="false"/>
+          <w:color w:val="000000"/>
+        </w:rPr>
+        <w:t>Generel understøttelse af .pef filformatet (Portable Embosser Format) både som input og output.</w:t>
+      </w:r>
+    </w:p>
+    <w:p>
+      <w:pPr>
+        <w:pStyle w:val="Standard"/>
+        <w:bidi w:val="0"/>
+        <w:jc w:val="left"/>
+        <w:rPr>
+          <w:b w:val="false"/>
+          <w:b w:val="false"/>
+          <w:bCs w:val="false"/>
+          <w:color w:val="000000"/>
+        </w:rPr>
+      </w:pPr>
+      <w:r>
+        <w:rPr>
+          <w:b w:val="false"/>
+          <w:bCs w:val="false"/>
+          <w:color w:val="000000"/>
+        </w:rPr>
+      </w:r>
+    </w:p>
+    <w:p>
+      <w:pPr>
+        <w:pStyle w:val="Standard"/>
+        <w:bidi w:val="0"/>
+        <w:jc w:val="left"/>
+        <w:rPr>
+          <w:b w:val="false"/>
+          <w:b w:val="false"/>
+          <w:bCs w:val="false"/>
+          <w:color w:val="000000"/>
+        </w:rPr>
+      </w:pPr>
+      <w:r>
+        <w:rPr>
+          <w:b w:val="false"/>
+          <w:bCs w:val="false"/>
+          <w:color w:val="000000"/>
+        </w:rPr>
+        <w:t>En ny profil ”Højhastigheds Punktprinter” er tilføjet. Denne profil indeholder som  default standard opsætninger til en ”Braillo  650 SF”  (Filformat=PEF, Bredde=32, Højde= 25) men kan ligesom de 3 eksisterende profiler let tilpasses af brugeren.</w:t>
       </w:r>
     </w:p>
     <w:p>
@@ -621,28 +529,87 @@
         <w:pStyle w:val="Standard"/>
         <w:bidi w:val="0"/>
         <w:jc w:val="left"/>
-        <w:rPr>
-          <w:b w:val="false"/>
-          <w:b w:val="false"/>
-          <w:bCs w:val="false"/>
-          <w:color w:val="000000"/>
-        </w:rPr>
-      </w:pPr>
-      <w:r>
-        <w:rPr>
-          <w:b w:val="false"/>
-          <w:bCs w:val="false"/>
-          <w:color w:val="000000"/>
-        </w:rPr>
-        <w:t xml:space="preserve">Sammensatte punktnode-symboler </w:t>
-      </w:r>
-      <w:r>
-        <w:rPr>
-          <w:b w:val="false"/>
-          <w:bCs w:val="false"/>
-          <w:color w:val="000000"/>
-        </w:rPr>
-        <w:t>deles ikke ved linjeskift, men flyttes udelt ned på næste linje hvis der ikke er plads på den nuværende linje til hele det sammensatte s</w:t>
+        <w:rPr/>
+      </w:pPr>
+      <w:r>
+        <w:rPr>
+          <w:b w:val="false"/>
+          <w:bCs w:val="false"/>
+          <w:color w:val="000000"/>
+        </w:rPr>
+        <w:t xml:space="preserve">Sammensatte punktnode-symboler deles </w:t>
+      </w:r>
+      <w:r>
+        <w:rPr>
+          <w:b w:val="false"/>
+          <w:bCs w:val="false"/>
+          <w:color w:val="000000"/>
+        </w:rPr>
+        <w:t xml:space="preserve">nu </w:t>
+      </w:r>
+      <w:r>
+        <w:rPr>
+          <w:b w:val="false"/>
+          <w:bCs w:val="false"/>
+          <w:color w:val="000000"/>
+        </w:rPr>
+        <w:t xml:space="preserve">ikke </w:t>
+      </w:r>
+      <w:r>
+        <w:rPr>
+          <w:b w:val="false"/>
+          <w:bCs w:val="false"/>
+          <w:color w:val="000000"/>
+        </w:rPr>
+        <w:t xml:space="preserve">mere </w:t>
+      </w:r>
+      <w:r>
+        <w:rPr>
+          <w:b w:val="false"/>
+          <w:bCs w:val="false"/>
+          <w:color w:val="000000"/>
+        </w:rPr>
+        <w:t>ved linjeskift, men flyttes udelt ned på næste linje hvis der ikke er plads på den nuværende linje til hele det sammensatte s</w:t>
+      </w:r>
+      <w:r>
+        <w:rPr>
+          <w:b w:val="false"/>
+          <w:bCs w:val="false"/>
+          <w:color w:val="000000"/>
+        </w:rPr>
+        <w:t>ymbol</w:t>
+      </w:r>
+    </w:p>
+    <w:p>
+      <w:pPr>
+        <w:pStyle w:val="Standard"/>
+        <w:bidi w:val="0"/>
+        <w:jc w:val="left"/>
+        <w:rPr>
+          <w:b w:val="false"/>
+          <w:b w:val="false"/>
+          <w:bCs w:val="false"/>
+          <w:color w:val="000000"/>
+        </w:rPr>
+      </w:pPr>
+      <w:r>
+        <w:rPr/>
+      </w:r>
+    </w:p>
+    <w:p>
+      <w:pPr>
+        <w:pStyle w:val="Standard"/>
+        <w:bidi w:val="0"/>
+        <w:jc w:val="left"/>
+        <w:rPr/>
+      </w:pPr>
+      <w:r>
+        <w:rPr>
+          <w:b w:val="false"/>
+          <w:bCs w:val="false"/>
+          <w:color w:val="000000"/>
+        </w:rPr>
+        <w:t>Den fejlagtige betegnelse ”ophævelsestegn” er rettet til ”opløsningstegn”.</w:t>
       </w:r>
     </w:p>
     <w:p>
@@ -1991,14 +1958,10 @@
         <w:pStyle w:val="Standard"/>
         <w:bidi w:val="0"/>
         <w:jc w:val="left"/>
-        <w:rPr>
-          <w:color w:val="C9211E"/>
-        </w:rPr>
-      </w:pPr>
-      <w:r>
-        <w:rPr>
-          <w:color w:val="C9211E"/>
-        </w:rPr>
+        <w:rPr/>
+      </w:pPr>
+      <w:r>
+        <w:rPr/>
       </w:r>
     </w:p>
     <w:sectPr>

</xml_diff>

<commit_message>
Fixed error 485 Dutch Instillingen -> Instellingen
</commit_message>
<xml_diff>
--- a/Documentation/Official Documentation/Release Notes/Release Notes for IBOS Nodelæser version 4.1.0.0.docx
+++ b/Documentation/Official Documentation/Release Notes/Release Notes for IBOS Nodelæser version 4.1.0.0.docx
@@ -537,79 +537,75 @@
           <w:bCs w:val="false"/>
           <w:color w:val="000000"/>
         </w:rPr>
-        <w:t xml:space="preserve">Sammensatte punktnode-symboler deles </w:t>
-      </w:r>
-      <w:r>
-        <w:rPr>
-          <w:b w:val="false"/>
-          <w:bCs w:val="false"/>
-          <w:color w:val="000000"/>
-        </w:rPr>
-        <w:t xml:space="preserve">nu </w:t>
-      </w:r>
-      <w:r>
-        <w:rPr>
-          <w:b w:val="false"/>
-          <w:bCs w:val="false"/>
-          <w:color w:val="000000"/>
-        </w:rPr>
-        <w:t xml:space="preserve">ikke </w:t>
-      </w:r>
-      <w:r>
-        <w:rPr>
-          <w:b w:val="false"/>
-          <w:bCs w:val="false"/>
-          <w:color w:val="000000"/>
-        </w:rPr>
-        <w:t xml:space="preserve">mere </w:t>
-      </w:r>
-      <w:r>
-        <w:rPr>
-          <w:b w:val="false"/>
-          <w:bCs w:val="false"/>
-          <w:color w:val="000000"/>
-        </w:rPr>
-        <w:t>ved linjeskift, men flyttes udelt ned på næste linje hvis der ikke er plads på den nuværende linje til hele det sammensatte s</w:t>
-      </w:r>
-      <w:r>
-        <w:rPr>
-          <w:b w:val="false"/>
-          <w:bCs w:val="false"/>
-          <w:color w:val="000000"/>
-        </w:rPr>
-        <w:t>ymbol</w:t>
-      </w:r>
-    </w:p>
-    <w:p>
-      <w:pPr>
-        <w:pStyle w:val="Standard"/>
-        <w:bidi w:val="0"/>
-        <w:jc w:val="left"/>
-        <w:rPr>
-          <w:b w:val="false"/>
-          <w:b w:val="false"/>
-          <w:bCs w:val="false"/>
-          <w:color w:val="000000"/>
-        </w:rPr>
-      </w:pPr>
-      <w:r>
+        <w:t>Sammensatte punktnode-symboler deles nu ikke mere ved linjeskift, men flyttes udelt ned på næste linje hvis der ikke er plads på den nuværende linje til hele det sammensatte symbol</w:t>
+      </w:r>
+    </w:p>
+    <w:p>
+      <w:pPr>
+        <w:pStyle w:val="Standard"/>
+        <w:bidi w:val="0"/>
+        <w:jc w:val="left"/>
+        <w:rPr>
+          <w:b w:val="false"/>
+          <w:b w:val="false"/>
+          <w:bCs w:val="false"/>
+          <w:color w:val="000000"/>
+        </w:rPr>
+      </w:pPr>
+      <w:r>
+        <w:rPr>
+          <w:b w:val="false"/>
+          <w:bCs w:val="false"/>
+          <w:color w:val="000000"/>
+        </w:rPr>
+      </w:r>
+    </w:p>
+    <w:p>
+      <w:pPr>
+        <w:pStyle w:val="Standard"/>
+        <w:bidi w:val="0"/>
+        <w:jc w:val="left"/>
         <w:rPr/>
-      </w:r>
-    </w:p>
-    <w:p>
-      <w:pPr>
-        <w:pStyle w:val="Standard"/>
-        <w:bidi w:val="0"/>
-        <w:jc w:val="left"/>
+      </w:pPr>
+      <w:r>
+        <w:rPr>
+          <w:b w:val="false"/>
+          <w:bCs w:val="false"/>
+          <w:color w:val="000000"/>
+        </w:rPr>
+        <w:t>Den fejlagtige betegnelse ”ophævelsestegn” er rettet til ”opløsningstegn”.</w:t>
+      </w:r>
+    </w:p>
+    <w:p>
+      <w:pPr>
+        <w:pStyle w:val="Standard"/>
+        <w:bidi w:val="0"/>
+        <w:jc w:val="left"/>
+        <w:rPr>
+          <w:b w:val="false"/>
+          <w:b w:val="false"/>
+          <w:bCs w:val="false"/>
+          <w:color w:val="000000"/>
+        </w:rPr>
+      </w:pPr>
+      <w:r>
         <w:rPr/>
-      </w:pPr>
-      <w:r>
-        <w:rPr>
-          <w:b w:val="false"/>
-          <w:bCs w:val="false"/>
-          <w:color w:val="000000"/>
-        </w:rPr>
-        <w:t>Den fejlagtige betegnelse ”ophævelsestegn” er rettet til ”opløsningstegn”.</w:t>
+      </w:r>
+    </w:p>
+    <w:p>
+      <w:pPr>
+        <w:pStyle w:val="Standard"/>
+        <w:bidi w:val="0"/>
+        <w:jc w:val="left"/>
+        <w:rPr/>
+      </w:pPr>
+      <w:r>
+        <w:rPr>
+          <w:b w:val="false"/>
+          <w:bCs w:val="false"/>
+          <w:color w:val="000000"/>
+        </w:rPr>
+        <w:t>Forkert stavet hollandsk tekst ”Instillingen” rettet til ”Instellingen””</w:t>
       </w:r>
     </w:p>
     <w:p>

</xml_diff>

<commit_message>
Start release notes for 4.2
</commit_message>
<xml_diff>
--- a/Documentation/Official Documentation/Release Notes/Release Notes for IBOS Nodelæser version 4.1.0.0.docx
+++ b/Documentation/Official Documentation/Release Notes/Release Notes for IBOS Nodelæser version 4.1.0.0.docx
@@ -337,12 +337,7 @@
         <w:pStyle w:val="Standard"/>
         <w:bidi w:val="0"/>
         <w:jc w:val="left"/>
-        <w:rPr>
-          <w:b w:val="false"/>
-          <w:b w:val="false"/>
-          <w:bCs w:val="false"/>
-          <w:color w:val="000000"/>
-        </w:rPr>
+        <w:rPr/>
       </w:pPr>
       <w:r>
         <w:rPr>
@@ -374,6 +369,56 @@
         </w:rPr>
       </w:pPr>
       <w:r>
+        <w:rPr/>
+      </w:r>
+    </w:p>
+    <w:p>
+      <w:pPr>
+        <w:pStyle w:val="Standard"/>
+        <w:bidi w:val="0"/>
+        <w:jc w:val="left"/>
+        <w:rPr>
+          <w:b w:val="false"/>
+          <w:b w:val="false"/>
+          <w:bCs w:val="false"/>
+          <w:color w:val="000000"/>
+        </w:rPr>
+      </w:pPr>
+      <w:r>
+        <w:rPr/>
+      </w:r>
+    </w:p>
+    <w:p>
+      <w:pPr>
+        <w:pStyle w:val="Standard"/>
+        <w:bidi w:val="0"/>
+        <w:jc w:val="left"/>
+        <w:rPr>
+          <w:color w:val="00A933"/>
+        </w:rPr>
+      </w:pPr>
+      <w:r>
+        <w:rPr>
+          <w:b w:val="false"/>
+          <w:bCs w:val="false"/>
+          <w:color w:val="00A933"/>
+        </w:rPr>
+        <w:t>4.2: Punktnodesupport for ”dynamics”, det vil sige piano, forte etc</w:t>
+      </w:r>
+    </w:p>
+    <w:p>
+      <w:pPr>
+        <w:pStyle w:val="Standard"/>
+        <w:bidi w:val="0"/>
+        <w:jc w:val="left"/>
+        <w:rPr>
+          <w:b w:val="false"/>
+          <w:b w:val="false"/>
+          <w:bCs w:val="false"/>
+          <w:color w:val="000000"/>
+        </w:rPr>
+      </w:pPr>
+      <w:r>
         <w:rPr>
           <w:b w:val="false"/>
           <w:bCs w:val="false"/>
@@ -589,7 +634,11 @@
         </w:rPr>
       </w:pPr>
       <w:r>
-        <w:rPr/>
+        <w:rPr>
+          <w:b w:val="false"/>
+          <w:bCs w:val="false"/>
+          <w:color w:val="000000"/>
+        </w:rPr>
       </w:r>
     </w:p>
     <w:p>
@@ -2006,7 +2055,7 @@
     </w:r>
     <w:r>
       <w:rPr/>
-      <w:t>3</w:t>
+      <w:t>4</w:t>
     </w:r>
     <w:r>
       <w:rPr/>

</xml_diff>